<commit_message>
Preenche link do repositorio e autoria no artigo
</commit_message>
<xml_diff>
--- a/docs/artigo/Artigo_DW_AdventureWorks_Unisales.docx
+++ b/docs/artigo/Artigo_DW_AdventureWorks_Unisales.docx
@@ -44,7 +44,7 @@
           <w:i w:val="0"/>
           <w:sz w:val="22"/>
         </w:rPr>
-        <w:t>[Nome completo do(a) autor(a)]*</w:t>
+        <w:t>Yahn de Freitas Santos*</w:t>
       </w:r>
     </w:p>
     <w:p>
@@ -5899,7 +5899,7 @@
           <w:i w:val="0"/>
           <w:sz w:val="24"/>
         </w:rPr>
-        <w:t>https://github.com/[usuario]/dw-adventureworks-produto1</w:t>
+        <w:t>https://github.com/Yahnfs/dw-adventureworks-produto1</w:t>
       </w:r>
     </w:p>
     <w:p>

</xml_diff>